<commit_message>
all the changes in information.docx
</commit_message>
<xml_diff>
--- a/information.docx
+++ b/information.docx
@@ -1,10 +1,10 @@
 
 <file path=word/document.xml><?xml version="1.0" encoding="utf-8"?>
-<w:document xmlns:wpc="http://schemas.microsoft.com/office/word/2010/wordprocessingCanvas" xmlns:cx="http://schemas.microsoft.com/office/drawing/2014/chartex" xmlns:cx1="http://schemas.microsoft.com/office/drawing/2015/9/8/chartex" xmlns:cx2="http://schemas.microsoft.com/office/drawing/2015/10/21/chartex" xmlns:cx3="http://schemas.microsoft.com/office/drawing/2016/5/9/chartex" xmlns:cx4="http://schemas.microsoft.com/office/drawing/2016/5/10/chartex" xmlns:cx5="http://schemas.microsoft.com/office/drawing/2016/5/11/chartex" xmlns:cx6="http://schemas.microsoft.com/office/drawing/2016/5/12/chartex" xmlns:cx7="http://schemas.microsoft.com/office/drawing/2016/5/13/chartex" xmlns:cx8="http://schemas.microsoft.com/office/drawing/2016/5/14/chartex" xmlns:mc="http://schemas.openxmlformats.org/markup-compatibility/2006" xmlns:aink="http://schemas.microsoft.com/office/drawing/2016/ink" xmlns:am3d="http://schemas.microsoft.com/office/drawing/2017/model3d" xmlns:o="urn:schemas-microsoft-com:office:office" xmlns:r="http://schemas.openxmlformats.org/officeDocument/2006/relationships" xmlns:m="http://schemas.openxmlformats.org/officeDocument/2006/math" xmlns:v="urn:schemas-microsoft-com:vml" xmlns:wp14="http://schemas.microsoft.com/office/word/2010/wordprocessingDrawing" xmlns:wp="http://schemas.openxmlformats.org/drawingml/2006/wordprocessingDrawing" xmlns:w10="urn:schemas-microsoft-com:office:word" xmlns:w="http://schemas.openxmlformats.org/wordprocessingml/2006/main" xmlns:w14="http://schemas.microsoft.com/office/word/2010/wordml" xmlns:w15="http://schemas.microsoft.com/office/word/2012/wordml" xmlns:w16cex="http://schemas.microsoft.com/office/word/2018/wordml/cex" xmlns:w16cid="http://schemas.microsoft.com/office/word/2016/wordml/cid" xmlns:w16="http://schemas.microsoft.com/office/word/2018/wordml" xmlns:w16sdtdh="http://schemas.microsoft.com/office/word/2020/wordml/sdtdatahash" xmlns:w16se="http://schemas.microsoft.com/office/word/2015/wordml/symex" xmlns:wpg="http://schemas.microsoft.com/office/word/2010/wordprocessingGroup" xmlns:wpi="http://schemas.microsoft.com/office/word/2010/wordprocessingInk" xmlns:wne="http://schemas.microsoft.com/office/word/2006/wordml" xmlns:wps="http://schemas.microsoft.com/office/word/2010/wordprocessingShape" mc:Ignorable="w14 w15 w16se w16cid w16 w16cex w16sdtdh wp14">
+<w:document xmlns:o="urn:schemas-microsoft-com:office:office" xmlns:r="http://schemas.openxmlformats.org/officeDocument/2006/relationships" xmlns:v="urn:schemas-microsoft-com:vml" xmlns:w="http://schemas.openxmlformats.org/wordprocessingml/2006/main" xmlns:w10="urn:schemas-microsoft-com:office:word" xmlns:wp="http://schemas.openxmlformats.org/drawingml/2006/wordprocessingDrawing" xmlns:wps="http://schemas.microsoft.com/office/word/2010/wordprocessingShape" xmlns:wpg="http://schemas.microsoft.com/office/word/2010/wordprocessingGroup" xmlns:mc="http://schemas.openxmlformats.org/markup-compatibility/2006" xmlns:wp14="http://schemas.microsoft.com/office/word/2010/wordprocessingDrawing" xmlns:w14="http://schemas.microsoft.com/office/word/2010/wordml" xmlns:w15="http://schemas.microsoft.com/office/word/2012/wordml" mc:Ignorable="w14 wp14 w15">
   <w:body>
     <w:p>
       <w:pPr>
-        <w:pStyle w:val="a3"/>
+        <w:pStyle w:val="Title"/>
         <w:rPr>
           <w:b/>
           <w:bCs/>
@@ -50,7 +50,7 @@
     </w:p>
     <w:p>
       <w:pPr>
-        <w:pStyle w:val="a5"/>
+        <w:pStyle w:val="Subtitle"/>
         <w:rPr>
           <w:sz w:val="32"/>
           <w:szCs w:val="32"/>
@@ -66,14 +66,22 @@
     </w:p>
     <w:p>
       <w:pPr>
-        <w:rPr>
-          <w:sz w:val="28"/>
-          <w:szCs w:val="28"/>
-        </w:rPr>
-      </w:pPr>
-    </w:p>
-    <w:p>
-      <w:pPr>
+        <w:pStyle w:val="Normal"/>
+        <w:rPr>
+          <w:sz w:val="28"/>
+          <w:szCs w:val="28"/>
+        </w:rPr>
+      </w:pPr>
+      <w:r>
+        <w:rPr>
+          <w:sz w:val="28"/>
+          <w:szCs w:val="28"/>
+        </w:rPr>
+      </w:r>
+    </w:p>
+    <w:p>
+      <w:pPr>
+        <w:pStyle w:val="Normal"/>
         <w:rPr>
           <w:sz w:val="28"/>
           <w:szCs w:val="28"/>
@@ -89,6 +97,7 @@
     </w:p>
     <w:p>
       <w:pPr>
+        <w:pStyle w:val="Normal"/>
         <w:rPr>
           <w:sz w:val="28"/>
           <w:szCs w:val="28"/>
@@ -119,6 +128,7 @@
     </w:p>
     <w:p>
       <w:pPr>
+        <w:pStyle w:val="Normal"/>
         <w:rPr>
           <w:sz w:val="28"/>
           <w:szCs w:val="28"/>
@@ -134,15 +144,22 @@
     </w:p>
     <w:p>
       <w:pPr>
-        <w:rPr>
-          <w:sz w:val="28"/>
-          <w:szCs w:val="28"/>
-        </w:rPr>
-      </w:pPr>
-    </w:p>
-    <w:p>
-      <w:pPr>
-        <w:pStyle w:val="a5"/>
+        <w:pStyle w:val="Normal"/>
+        <w:rPr>
+          <w:sz w:val="28"/>
+          <w:szCs w:val="28"/>
+        </w:rPr>
+      </w:pPr>
+      <w:r>
+        <w:rPr>
+          <w:sz w:val="28"/>
+          <w:szCs w:val="28"/>
+        </w:rPr>
+      </w:r>
+    </w:p>
+    <w:p>
+      <w:pPr>
+        <w:pStyle w:val="Subtitle"/>
         <w:rPr>
           <w:sz w:val="32"/>
           <w:szCs w:val="32"/>
@@ -158,6 +175,7 @@
     </w:p>
     <w:p>
       <w:pPr>
+        <w:pStyle w:val="Normal"/>
         <w:rPr>
           <w:sz w:val="28"/>
           <w:szCs w:val="28"/>
@@ -188,91 +206,361 @@
         </w:rPr>
         <w:t>StickMaker</w:t>
       </w:r>
+      <w:r>
+        <w:rPr>
+          <w:sz w:val="28"/>
+          <w:szCs w:val="28"/>
+          <w:lang w:val="en-US"/>
+        </w:rPr>
+      </w:r>
+      <w:commentRangeEnd w:id="1"/>
+      <w:r>
+        <w:commentReference w:id="1"/>
+      </w:r>
       <w:commentRangeEnd w:id="0"/>
       <w:r>
-        <w:rPr>
-          <w:rStyle w:val="a7"/>
-        </w:rPr>
         <w:commentReference w:id="0"/>
       </w:r>
-      <w:commentRangeEnd w:id="1"/>
-      <w:r>
-        <w:rPr>
-          <w:rStyle w:val="a7"/>
-        </w:rPr>
-        <w:commentReference w:id="1"/>
-      </w:r>
-    </w:p>
-    <w:p>
-      <w:pPr>
-        <w:rPr>
-          <w:sz w:val="28"/>
-          <w:szCs w:val="28"/>
-        </w:rPr>
-      </w:pPr>
+      <w:r>
+        <w:rPr>
+          <w:sz w:val="28"/>
+          <w:szCs w:val="28"/>
+          <w:lang w:val="en-US"/>
+        </w:rPr>
+      </w:r>
+    </w:p>
+    <w:p>
+      <w:pPr>
+        <w:pStyle w:val="Normal"/>
+        <w:rPr>
+          <w:sz w:val="28"/>
+          <w:szCs w:val="28"/>
+        </w:rPr>
+      </w:pPr>
+      <w:r>
+        <w:rPr>
+          <w:sz w:val="28"/>
+          <w:szCs w:val="28"/>
+        </w:rPr>
+        <w:t xml:space="preserve">18.02.2024 — </w:t>
+      </w:r>
+      <w:commentRangeStart w:id="2"/>
+      <w:r>
+        <w:rPr>
+          <w:sz w:val="28"/>
+          <w:szCs w:val="28"/>
+        </w:rPr>
+        <w:t>Продолжение разработки после приостановки</w:t>
+      </w:r>
+      <w:commentRangeEnd w:id="2"/>
+      <w:r>
+        <w:commentReference w:id="2"/>
+      </w:r>
+      <w:r>
+        <w:rPr>
+          <w:sz w:val="28"/>
+          <w:szCs w:val="28"/>
+        </w:rPr>
+      </w:r>
+    </w:p>
+    <w:p>
+      <w:pPr>
+        <w:pStyle w:val="Normal"/>
+        <w:rPr>
+          <w:sz w:val="28"/>
+          <w:szCs w:val="28"/>
+        </w:rPr>
+      </w:pPr>
+      <w:r>
+        <w:rPr>
+          <w:sz w:val="28"/>
+          <w:szCs w:val="28"/>
+        </w:rPr>
+      </w:r>
+    </w:p>
+    <w:p>
+      <w:pPr>
+        <w:pStyle w:val="Normal"/>
+        <w:rPr>
+          <w:sz w:val="28"/>
+          <w:szCs w:val="28"/>
+        </w:rPr>
+      </w:pPr>
+      <w:r>
+        <w:rPr>
+          <w:sz w:val="28"/>
+          <w:szCs w:val="28"/>
+        </w:rPr>
+      </w:r>
+    </w:p>
+    <w:p>
+      <w:pPr>
+        <w:pStyle w:val="Normal"/>
+        <w:rPr>
+          <w:sz w:val="28"/>
+          <w:szCs w:val="28"/>
+        </w:rPr>
+      </w:pPr>
+      <w:r>
+        <w:rPr>
+          <w:sz w:val="28"/>
+          <w:szCs w:val="28"/>
+        </w:rPr>
+        <w:t>TODO:</w:t>
+      </w:r>
+    </w:p>
+    <w:p>
+      <w:pPr>
+        <w:pStyle w:val="Normal"/>
+        <w:rPr>
+          <w:sz w:val="28"/>
+          <w:szCs w:val="28"/>
+        </w:rPr>
+      </w:pPr>
+      <w:r>
+        <w:rPr>
+          <w:sz w:val="28"/>
+          <w:szCs w:val="28"/>
+        </w:rPr>
+        <w:t>1. Необходимо добавить возможность создавать новые наборы</w:t>
+      </w:r>
+    </w:p>
+    <w:p>
+      <w:pPr>
+        <w:pStyle w:val="Normal"/>
+        <w:rPr>
+          <w:sz w:val="28"/>
+          <w:szCs w:val="28"/>
+        </w:rPr>
+      </w:pPr>
+      <w:r>
+        <w:rPr>
+          <w:sz w:val="28"/>
+          <w:szCs w:val="28"/>
+        </w:rPr>
+        <w:t>2. Необходима пагинация при большом объеме стикерпаков</w:t>
+      </w:r>
+    </w:p>
+    <w:p>
+      <w:pPr>
+        <w:pStyle w:val="Normal"/>
+        <w:rPr>
+          <w:sz w:val="28"/>
+          <w:szCs w:val="28"/>
+        </w:rPr>
+      </w:pPr>
+      <w:r>
+        <w:rPr>
+          <w:sz w:val="28"/>
+          <w:szCs w:val="28"/>
+        </w:rPr>
+        <w:t>3. Нужна админ-панель</w:t>
+      </w:r>
+    </w:p>
+    <w:p>
+      <w:pPr>
+        <w:pStyle w:val="Normal"/>
+        <w:rPr>
+          <w:sz w:val="28"/>
+          <w:szCs w:val="28"/>
+        </w:rPr>
+      </w:pPr>
+      <w:r>
+        <w:rPr>
+          <w:sz w:val="28"/>
+          <w:szCs w:val="28"/>
+        </w:rPr>
+        <w:t>3.1. Статистика</w:t>
+      </w:r>
+    </w:p>
+    <w:p>
+      <w:pPr>
+        <w:pStyle w:val="Normal"/>
+        <w:rPr>
+          <w:sz w:val="28"/>
+          <w:szCs w:val="28"/>
+        </w:rPr>
+      </w:pPr>
+      <w:r>
+        <w:rPr>
+          <w:sz w:val="28"/>
+          <w:szCs w:val="28"/>
+        </w:rPr>
+        <w:t>3.2. Мотив</w:t>
+      </w:r>
+    </w:p>
+    <w:p>
+      <w:pPr>
+        <w:pStyle w:val="Normal"/>
+        <w:rPr>
+          <w:sz w:val="28"/>
+          <w:szCs w:val="28"/>
+        </w:rPr>
+      </w:pPr>
+      <w:r>
+        <w:rPr>
+          <w:sz w:val="28"/>
+          <w:szCs w:val="28"/>
+        </w:rPr>
+        <w:t>3.3. Рассылка</w:t>
+      </w:r>
+    </w:p>
+    <w:p>
+      <w:pPr>
+        <w:pStyle w:val="Normal"/>
+        <w:rPr>
+          <w:sz w:val="28"/>
+          <w:szCs w:val="28"/>
+        </w:rPr>
+      </w:pPr>
+      <w:r>
+        <w:rPr>
+          <w:sz w:val="28"/>
+          <w:szCs w:val="28"/>
+        </w:rPr>
+        <w:t>3.4. Создание персональных рекламных ссылок</w:t>
+      </w:r>
+    </w:p>
+    <w:p>
+      <w:pPr>
+        <w:pStyle w:val="Normal"/>
+        <w:rPr>
+          <w:sz w:val="28"/>
+          <w:szCs w:val="28"/>
+        </w:rPr>
+      </w:pPr>
+      <w:r>
+        <w:rPr>
+          <w:sz w:val="28"/>
+          <w:szCs w:val="28"/>
+        </w:rPr>
+        <w:t>3.5. Создание постов в канал</w:t>
+      </w:r>
+    </w:p>
+    <w:p>
+      <w:pPr>
+        <w:pStyle w:val="Normal"/>
+        <w:rPr>
+          <w:sz w:val="28"/>
+          <w:szCs w:val="28"/>
+        </w:rPr>
+      </w:pPr>
+      <w:r>
+        <w:rPr>
+          <w:sz w:val="28"/>
+          <w:szCs w:val="28"/>
+        </w:rPr>
+        <w:t>4. Автоответ на заявки с просьбой воспользоваться ботом</w:t>
+      </w:r>
+    </w:p>
+    <w:p>
+      <w:pPr>
+        <w:pStyle w:val="Normal"/>
+        <w:spacing w:before="0" w:after="160"/>
+        <w:rPr>
+          <w:sz w:val="28"/>
+          <w:szCs w:val="28"/>
+        </w:rPr>
+      </w:pPr>
+      <w:r>
+        <w:rPr>
+          <w:sz w:val="28"/>
+          <w:szCs w:val="28"/>
+        </w:rPr>
+        <w:t>5. В будущем надо сделать автопроврерку названий наборов с целью присечь удаление юзернейма бота из названия</w:t>
+      </w:r>
     </w:p>
     <w:sectPr>
+      <w:type w:val="nextPage"/>
       <w:pgSz w:w="11906" w:h="16838"/>
-      <w:pgMar w:top="1134" w:right="850" w:bottom="1134" w:left="1701" w:header="708" w:footer="708" w:gutter="0"/>
-      <w:cols w:space="708"/>
-      <w:docGrid w:linePitch="360"/>
+      <w:pgMar w:left="1701" w:right="850" w:gutter="0" w:header="0" w:top="1134" w:footer="0" w:bottom="1134"/>
+      <w:pgNumType w:fmt="decimal"/>
+      <w:formProt w:val="false"/>
+      <w:textDirection w:val="lrTb"/>
+      <w:docGrid w:type="default" w:linePitch="360" w:charSpace="4096"/>
     </w:sectPr>
   </w:body>
 </w:document>
 </file>
 
 <file path=word/comments.xml><?xml version="1.0" encoding="utf-8"?>
-<w:comments xmlns:wpc="http://schemas.microsoft.com/office/word/2010/wordprocessingCanvas" xmlns:cx="http://schemas.microsoft.com/office/drawing/2014/chartex" xmlns:cx1="http://schemas.microsoft.com/office/drawing/2015/9/8/chartex" xmlns:cx2="http://schemas.microsoft.com/office/drawing/2015/10/21/chartex" xmlns:cx3="http://schemas.microsoft.com/office/drawing/2016/5/9/chartex" xmlns:cx4="http://schemas.microsoft.com/office/drawing/2016/5/10/chartex" xmlns:cx5="http://schemas.microsoft.com/office/drawing/2016/5/11/chartex" xmlns:cx6="http://schemas.microsoft.com/office/drawing/2016/5/12/chartex" xmlns:cx7="http://schemas.microsoft.com/office/drawing/2016/5/13/chartex" xmlns:cx8="http://schemas.microsoft.com/office/drawing/2016/5/14/chartex" xmlns:mc="http://schemas.openxmlformats.org/markup-compatibility/2006" xmlns:aink="http://schemas.microsoft.com/office/drawing/2016/ink" xmlns:am3d="http://schemas.microsoft.com/office/drawing/2017/model3d" xmlns:o="urn:schemas-microsoft-com:office:office" xmlns:r="http://schemas.openxmlformats.org/officeDocument/2006/relationships" xmlns:m="http://schemas.openxmlformats.org/officeDocument/2006/math" xmlns:v="urn:schemas-microsoft-com:vml" xmlns:wp14="http://schemas.microsoft.com/office/word/2010/wordprocessingDrawing" xmlns:wp="http://schemas.openxmlformats.org/drawingml/2006/wordprocessingDrawing" xmlns:w10="urn:schemas-microsoft-com:office:word" xmlns:w="http://schemas.openxmlformats.org/wordprocessingml/2006/main" xmlns:w14="http://schemas.microsoft.com/office/word/2010/wordml" xmlns:w15="http://schemas.microsoft.com/office/word/2012/wordml" xmlns:w16cex="http://schemas.microsoft.com/office/word/2018/wordml/cex" xmlns:w16cid="http://schemas.microsoft.com/office/word/2016/wordml/cid" xmlns:w16="http://schemas.microsoft.com/office/word/2018/wordml" xmlns:w16sdtdh="http://schemas.microsoft.com/office/word/2020/wordml/sdtdatahash" xmlns:w16se="http://schemas.microsoft.com/office/word/2015/wordml/symex" xmlns:wpg="http://schemas.microsoft.com/office/word/2010/wordprocessingGroup" xmlns:wpi="http://schemas.microsoft.com/office/word/2010/wordprocessingInk" xmlns:wne="http://schemas.microsoft.com/office/word/2006/wordml" xmlns:wps="http://schemas.microsoft.com/office/word/2010/wordprocessingShape" mc:Ignorable="w14 w15 w16se w16cid w16 w16cex w16sdtdh wp14">
-  <w:comment w:id="0" w:author="Cesare Muchaches" w:date="2023-10-19T00:31:00Z" w:initials="CM">
-    <w:p>
-      <w:pPr>
-        <w:pStyle w:val="a8"/>
-      </w:pPr>
-      <w:r>
-        <w:rPr>
-          <w:rStyle w:val="a7"/>
-        </w:rPr>
-        <w:annotationRef/>
-      </w:r>
-      <w:r>
-        <w:t>Добавлена регистрация пользователя</w:t>
-      </w:r>
-      <w:r>
-        <w:t>,</w:t>
-      </w:r>
-      <w:r>
-        <w:t xml:space="preserve"> сделан фундамент бота</w:t>
-      </w:r>
-      <w:r>
-        <w:t>:</w:t>
-      </w:r>
-      <w:r>
-        <w:t xml:space="preserve"> базовые модели</w:t>
-      </w:r>
-      <w:r>
-        <w:t>,</w:t>
-      </w:r>
-      <w:r>
-        <w:t xml:space="preserve"> классы</w:t>
-      </w:r>
-      <w:r>
-        <w:t>,</w:t>
-      </w:r>
-      <w:r>
-        <w:t xml:space="preserve"> конфиг для работы бота</w:t>
+<w:comments xmlns:o="urn:schemas-microsoft-com:office:office" xmlns:r="http://schemas.openxmlformats.org/officeDocument/2006/relationships" xmlns:v="urn:schemas-microsoft-com:vml" xmlns:w="http://schemas.openxmlformats.org/wordprocessingml/2006/main" xmlns:w10="urn:schemas-microsoft-com:office:word" xmlns:wp="http://schemas.openxmlformats.org/drawingml/2006/wordprocessingDrawing" xmlns:wps="http://schemas.microsoft.com/office/word/2010/wordprocessingShape" xmlns:wpg="http://schemas.microsoft.com/office/word/2010/wordprocessingGroup" xmlns:mc="http://schemas.openxmlformats.org/markup-compatibility/2006" xmlns:wp14="http://schemas.microsoft.com/office/word/2010/wordprocessingDrawing" xmlns:w14="http://schemas.microsoft.com/office/word/2010/wordml" xmlns:w15="http://schemas.microsoft.com/office/word/2012/wordml" mc:Ignorable="w14 wp14 w15">
+  <w:comment w:id="1" w:author="Cesare Muchaches" w:date="2023-10-19T00:31:00Z" w:initials="CM">
+    <w:p>
+      <w:pPr>
+        <w:overflowPunct w:val="false"/>
+        <w:spacing w:before="0" w:after="0" w:lineRule="auto" w:line="240"/>
+        <w:rPr/>
+      </w:pPr>
+      <w:r>
+        <w:rPr>
+          <w:rFonts w:ascii="Liberation Serif" w:hAnsi="Liberation Serif" w:eastAsia="DejaVu Sans" w:cs="DejaVu Sans"/>
+          <w:sz w:val="24"/>
+          <w:szCs w:val="24"/>
+          <w:lang w:val="en-US" w:eastAsia="en-US" w:bidi="en-US"/>
+        </w:rPr>
+        <w:t>Добавлена регистрация пользователя, сделан фундамент бота: базовые модели, классы, конфиг для работы бота</w:t>
       </w:r>
     </w:p>
   </w:comment>
-  <w:comment w:id="1" w:author="Cesare Muchaches" w:date="2023-10-19T00:32:00Z" w:initials="CM">
-    <w:p>
-      <w:pPr>
-        <w:pStyle w:val="a8"/>
-      </w:pPr>
-      <w:r>
-        <w:rPr>
-          <w:rStyle w:val="a7"/>
-        </w:rPr>
-        <w:annotationRef/>
+  <w:comment w:id="0" w:author="Cesare Muchaches" w:date="2023-10-19T00:32:00Z" w:initials="CM">
+    <w:p>
+      <w:pPr>
+        <w:overflowPunct w:val="false"/>
+        <w:spacing w:before="0" w:after="0" w:lineRule="auto" w:line="240"/>
+        <w:rPr/>
+      </w:pPr>
+      <w:r>
+        <w:rPr>
+          <w:rFonts w:ascii="Liberation Serif" w:hAnsi="Liberation Serif" w:eastAsia="DejaVu Sans" w:cs="DejaVu Sans"/>
+          <w:sz w:val="24"/>
+          <w:szCs w:val="24"/>
+          <w:lang w:val="en-US" w:eastAsia="en-US" w:bidi="en-US"/>
+        </w:rPr>
+      </w:r>
+    </w:p>
+  </w:comment>
+  <w:comment w:id="2" w:author="Unknown Author" w:date="2024-02-18T03:32:45Z" w:initials="">
+    <w:p>
+      <w:pPr>
+        <w:kinsoku w:val="true"/>
+        <w:overflowPunct w:val="false"/>
+        <w:autoSpaceDE w:val="true"/>
+        <w:bidi w:val="0"/>
+        <w:spacing w:before="0" w:after="0" w:lineRule="auto" w:line="240"/>
+        <w:ind w:hanging="0"/>
+        <w:jc w:val="left"/>
+        <w:rPr/>
+      </w:pPr>
+      <w:r>
+        <w:rPr>
+          <w:rFonts w:eastAsia="Calibri" w:cstheme="minorBidi" w:eastAsiaTheme="minorHAnsi" w:cs="" w:ascii="Calibri" w:hAnsi="Calibri"/>
+          <w:b w:val="false"/>
+          <w:bCs w:val="false"/>
+          <w:i w:val="false"/>
+          <w:iCs w:val="false"/>
+          <w:caps w:val="false"/>
+          <w:smallCaps w:val="false"/>
+          <w:strike w:val="false"/>
+          <w:dstrike w:val="false"/>
+          <w:outline w:val="false"/>
+          <w:shadow w:val="false"/>
+          <w:emboss w:val="false"/>
+          <w:imprint w:val="false"/>
+          <w:color w:val="auto"/>
+          <w:spacing w:val="0"/>
+          <w:w w:val="100"/>
+          <w:kern w:val="0"/>
+          <w:position w:val="0"/>
+          <w:sz w:val="20"/>
+          <w:szCs w:val="22"/>
+          <w:u w:val="none"/>
+          <w:shd w:fill="auto" w:val="clear"/>
+          <w:vertAlign w:val="baseline"/>
+          <w:em w:val="none"/>
+          <w:lang w:bidi="ar-SA" w:eastAsia="en-US" w:val="ru-RU"/>
+        </w:rPr>
+        <w:t>Завершено полное управление набором стикеров, создана система регистрации, жалоб.</w:t>
       </w:r>
     </w:p>
   </w:comment>
@@ -280,40 +568,17 @@
 </file>
 
 <file path=word/commentsExtended.xml><?xml version="1.0" encoding="utf-8"?>
-<w15:commentsEx xmlns:wpc="http://schemas.microsoft.com/office/word/2010/wordprocessingCanvas" xmlns:cx="http://schemas.microsoft.com/office/drawing/2014/chartex" xmlns:cx1="http://schemas.microsoft.com/office/drawing/2015/9/8/chartex" xmlns:cx2="http://schemas.microsoft.com/office/drawing/2015/10/21/chartex" xmlns:cx3="http://schemas.microsoft.com/office/drawing/2016/5/9/chartex" xmlns:cx4="http://schemas.microsoft.com/office/drawing/2016/5/10/chartex" xmlns:cx5="http://schemas.microsoft.com/office/drawing/2016/5/11/chartex" xmlns:cx6="http://schemas.microsoft.com/office/drawing/2016/5/12/chartex" xmlns:cx7="http://schemas.microsoft.com/office/drawing/2016/5/13/chartex" xmlns:cx8="http://schemas.microsoft.com/office/drawing/2016/5/14/chartex" xmlns:mc="http://schemas.openxmlformats.org/markup-compatibility/2006" xmlns:aink="http://schemas.microsoft.com/office/drawing/2016/ink" xmlns:am3d="http://schemas.microsoft.com/office/drawing/2017/model3d" xmlns:o="urn:schemas-microsoft-com:office:office" xmlns:r="http://schemas.openxmlformats.org/officeDocument/2006/relationships" xmlns:m="http://schemas.openxmlformats.org/officeDocument/2006/math" xmlns:v="urn:schemas-microsoft-com:vml" xmlns:wp14="http://schemas.microsoft.com/office/word/2010/wordprocessingDrawing" xmlns:wp="http://schemas.openxmlformats.org/drawingml/2006/wordprocessingDrawing" xmlns:w10="urn:schemas-microsoft-com:office:word" xmlns:w="http://schemas.openxmlformats.org/wordprocessingml/2006/main" xmlns:w14="http://schemas.microsoft.com/office/word/2010/wordml" xmlns:w15="http://schemas.microsoft.com/office/word/2012/wordml" xmlns:w16cex="http://schemas.microsoft.com/office/word/2018/wordml/cex" xmlns:w16cid="http://schemas.microsoft.com/office/word/2016/wordml/cid" xmlns:w16="http://schemas.microsoft.com/office/word/2018/wordml" xmlns:w16sdtdh="http://schemas.microsoft.com/office/word/2020/wordml/sdtdatahash" xmlns:w16se="http://schemas.microsoft.com/office/word/2015/wordml/symex" xmlns:wpg="http://schemas.microsoft.com/office/word/2010/wordprocessingGroup" xmlns:wpi="http://schemas.microsoft.com/office/word/2010/wordprocessingInk" xmlns:wne="http://schemas.microsoft.com/office/word/2006/wordml" xmlns:wps="http://schemas.microsoft.com/office/word/2010/wordprocessingShape" mc:Ignorable="w14 w15 w16se w16cid w16 w16cex w16sdtdh wp14">
-  <w15:commentEx w15:paraId="39F877B7" w15:done="1"/>
-  <w15:commentEx w15:paraId="73A15389" w15:paraIdParent="39F877B7" w15:done="0"/>
+<w15:commentsEx xmlns:mc="http://schemas.openxmlformats.org/markup-compatibility/2006" xmlns:w15="http://schemas.microsoft.com/office/word/2012/wordml" mc:Ignorable="w15">
+  <w15:commentEx w15:paraId="01000000" w15:done="1"/>
 </w15:commentsEx>
 </file>
 
-<file path=word/commentsExtensible.xml><?xml version="1.0" encoding="utf-8"?>
-<w16cex:commentsExtensible xmlns:wpc="http://schemas.microsoft.com/office/word/2010/wordprocessingCanvas" xmlns:cx="http://schemas.microsoft.com/office/drawing/2014/chartex" xmlns:cx1="http://schemas.microsoft.com/office/drawing/2015/9/8/chartex" xmlns:cx2="http://schemas.microsoft.com/office/drawing/2015/10/21/chartex" xmlns:cx3="http://schemas.microsoft.com/office/drawing/2016/5/9/chartex" xmlns:cx4="http://schemas.microsoft.com/office/drawing/2016/5/10/chartex" xmlns:cx5="http://schemas.microsoft.com/office/drawing/2016/5/11/chartex" xmlns:cx6="http://schemas.microsoft.com/office/drawing/2016/5/12/chartex" xmlns:cx7="http://schemas.microsoft.com/office/drawing/2016/5/13/chartex" xmlns:cx8="http://schemas.microsoft.com/office/drawing/2016/5/14/chartex" xmlns:mc="http://schemas.openxmlformats.org/markup-compatibility/2006" xmlns:aink="http://schemas.microsoft.com/office/drawing/2016/ink" xmlns:am3d="http://schemas.microsoft.com/office/drawing/2017/model3d" xmlns:o="urn:schemas-microsoft-com:office:office" xmlns:r="http://schemas.openxmlformats.org/officeDocument/2006/relationships" xmlns:m="http://schemas.openxmlformats.org/officeDocument/2006/math" xmlns:v="urn:schemas-microsoft-com:vml" xmlns:wp14="http://schemas.microsoft.com/office/word/2010/wordprocessingDrawing" xmlns:wp="http://schemas.openxmlformats.org/drawingml/2006/wordprocessingDrawing" xmlns:w10="urn:schemas-microsoft-com:office:word" xmlns:w="http://schemas.openxmlformats.org/wordprocessingml/2006/main" xmlns:w14="http://schemas.microsoft.com/office/word/2010/wordml" xmlns:w15="http://schemas.microsoft.com/office/word/2012/wordml" xmlns:w16cex="http://schemas.microsoft.com/office/word/2018/wordml/cex" xmlns:w16cid="http://schemas.microsoft.com/office/word/2016/wordml/cid" xmlns:w16="http://schemas.microsoft.com/office/word/2018/wordml" xmlns:w16sdtdh="http://schemas.microsoft.com/office/word/2020/wordml/sdtdatahash" xmlns:w16se="http://schemas.microsoft.com/office/word/2015/wordml/symex" xmlns:wpg="http://schemas.microsoft.com/office/word/2010/wordprocessingGroup" xmlns:wpi="http://schemas.microsoft.com/office/word/2010/wordprocessingInk" xmlns:wne="http://schemas.microsoft.com/office/word/2006/wordml" xmlns:wps="http://schemas.microsoft.com/office/word/2010/wordprocessingShape" mc:Ignorable="w14 w15 w16se w16cid w16 w16cex w16sdtdh wp14">
-  <w16cex:commentExtensible w16cex:durableId="28DAF74D" w16cex:dateUtc="2023-10-18T21:31:00Z"/>
-  <w16cex:commentExtensible w16cex:durableId="28DAF79A" w16cex:dateUtc="2023-10-18T21:32:00Z"/>
-</w16cex:commentsExtensible>
-</file>
-
-<file path=word/commentsIds.xml><?xml version="1.0" encoding="utf-8"?>
-<w16cid:commentsIds xmlns:wpc="http://schemas.microsoft.com/office/word/2010/wordprocessingCanvas" xmlns:cx="http://schemas.microsoft.com/office/drawing/2014/chartex" xmlns:cx1="http://schemas.microsoft.com/office/drawing/2015/9/8/chartex" xmlns:cx2="http://schemas.microsoft.com/office/drawing/2015/10/21/chartex" xmlns:cx3="http://schemas.microsoft.com/office/drawing/2016/5/9/chartex" xmlns:cx4="http://schemas.microsoft.com/office/drawing/2016/5/10/chartex" xmlns:cx5="http://schemas.microsoft.com/office/drawing/2016/5/11/chartex" xmlns:cx6="http://schemas.microsoft.com/office/drawing/2016/5/12/chartex" xmlns:cx7="http://schemas.microsoft.com/office/drawing/2016/5/13/chartex" xmlns:cx8="http://schemas.microsoft.com/office/drawing/2016/5/14/chartex" xmlns:mc="http://schemas.openxmlformats.org/markup-compatibility/2006" xmlns:aink="http://schemas.microsoft.com/office/drawing/2016/ink" xmlns:am3d="http://schemas.microsoft.com/office/drawing/2017/model3d" xmlns:o="urn:schemas-microsoft-com:office:office" xmlns:r="http://schemas.openxmlformats.org/officeDocument/2006/relationships" xmlns:m="http://schemas.openxmlformats.org/officeDocument/2006/math" xmlns:v="urn:schemas-microsoft-com:vml" xmlns:wp14="http://schemas.microsoft.com/office/word/2010/wordprocessingDrawing" xmlns:wp="http://schemas.openxmlformats.org/drawingml/2006/wordprocessingDrawing" xmlns:w10="urn:schemas-microsoft-com:office:word" xmlns:w="http://schemas.openxmlformats.org/wordprocessingml/2006/main" xmlns:w14="http://schemas.microsoft.com/office/word/2010/wordml" xmlns:w15="http://schemas.microsoft.com/office/word/2012/wordml" xmlns:w16cex="http://schemas.microsoft.com/office/word/2018/wordml/cex" xmlns:w16cid="http://schemas.microsoft.com/office/word/2016/wordml/cid" xmlns:w16="http://schemas.microsoft.com/office/word/2018/wordml" xmlns:w16sdtdh="http://schemas.microsoft.com/office/word/2020/wordml/sdtdatahash" xmlns:w16se="http://schemas.microsoft.com/office/word/2015/wordml/symex" xmlns:wpg="http://schemas.microsoft.com/office/word/2010/wordprocessingGroup" xmlns:wpi="http://schemas.microsoft.com/office/word/2010/wordprocessingInk" xmlns:wne="http://schemas.microsoft.com/office/word/2006/wordml" xmlns:wps="http://schemas.microsoft.com/office/word/2010/wordprocessingShape" mc:Ignorable="w14 w15 w16se w16cid w16 w16cex w16sdtdh wp14">
-  <w16cid:commentId w16cid:paraId="39F877B7" w16cid:durableId="28DAF74D"/>
-  <w16cid:commentId w16cid:paraId="73A15389" w16cid:durableId="28DAF79A"/>
-</w16cid:commentsIds>
-</file>
-
-<file path=word/people.xml><?xml version="1.0" encoding="utf-8"?>
-<w15:people xmlns:wpc="http://schemas.microsoft.com/office/word/2010/wordprocessingCanvas" xmlns:cx="http://schemas.microsoft.com/office/drawing/2014/chartex" xmlns:cx1="http://schemas.microsoft.com/office/drawing/2015/9/8/chartex" xmlns:cx2="http://schemas.microsoft.com/office/drawing/2015/10/21/chartex" xmlns:cx3="http://schemas.microsoft.com/office/drawing/2016/5/9/chartex" xmlns:cx4="http://schemas.microsoft.com/office/drawing/2016/5/10/chartex" xmlns:cx5="http://schemas.microsoft.com/office/drawing/2016/5/11/chartex" xmlns:cx6="http://schemas.microsoft.com/office/drawing/2016/5/12/chartex" xmlns:cx7="http://schemas.microsoft.com/office/drawing/2016/5/13/chartex" xmlns:cx8="http://schemas.microsoft.com/office/drawing/2016/5/14/chartex" xmlns:mc="http://schemas.openxmlformats.org/markup-compatibility/2006" xmlns:aink="http://schemas.microsoft.com/office/drawing/2016/ink" xmlns:am3d="http://schemas.microsoft.com/office/drawing/2017/model3d" xmlns:o="urn:schemas-microsoft-com:office:office" xmlns:r="http://schemas.openxmlformats.org/officeDocument/2006/relationships" xmlns:m="http://schemas.openxmlformats.org/officeDocument/2006/math" xmlns:v="urn:schemas-microsoft-com:vml" xmlns:wp14="http://schemas.microsoft.com/office/word/2010/wordprocessingDrawing" xmlns:wp="http://schemas.openxmlformats.org/drawingml/2006/wordprocessingDrawing" xmlns:w10="urn:schemas-microsoft-com:office:word" xmlns:w="http://schemas.openxmlformats.org/wordprocessingml/2006/main" xmlns:w14="http://schemas.microsoft.com/office/word/2010/wordml" xmlns:w15="http://schemas.microsoft.com/office/word/2012/wordml" xmlns:w16cex="http://schemas.microsoft.com/office/word/2018/wordml/cex" xmlns:w16cid="http://schemas.microsoft.com/office/word/2016/wordml/cid" xmlns:w16="http://schemas.microsoft.com/office/word/2018/wordml" xmlns:w16sdtdh="http://schemas.microsoft.com/office/word/2020/wordml/sdtdatahash" xmlns:w16se="http://schemas.microsoft.com/office/word/2015/wordml/symex" xmlns:wpg="http://schemas.microsoft.com/office/word/2010/wordprocessingGroup" xmlns:wpi="http://schemas.microsoft.com/office/word/2010/wordprocessingInk" xmlns:wne="http://schemas.microsoft.com/office/word/2006/wordml" xmlns:wps="http://schemas.microsoft.com/office/word/2010/wordprocessingShape" mc:Ignorable="w14 w15 w16se w16cid w16 w16cex w16sdtdh wp14">
-  <w15:person w15:author="Cesare Muchaches">
-    <w15:presenceInfo w15:providerId="Windows Live" w15:userId="619b108baa7696b5"/>
-  </w15:person>
-</w15:people>
-</file>
-
 <file path=word/styles.xml><?xml version="1.0" encoding="utf-8"?>
-<w:styles xmlns:mc="http://schemas.openxmlformats.org/markup-compatibility/2006" xmlns:r="http://schemas.openxmlformats.org/officeDocument/2006/relationships" xmlns:w="http://schemas.openxmlformats.org/wordprocessingml/2006/main" xmlns:w14="http://schemas.microsoft.com/office/word/2010/wordml" xmlns:w15="http://schemas.microsoft.com/office/word/2012/wordml" xmlns:w16cex="http://schemas.microsoft.com/office/word/2018/wordml/cex" xmlns:w16cid="http://schemas.microsoft.com/office/word/2016/wordml/cid" xmlns:w16="http://schemas.microsoft.com/office/word/2018/wordml" xmlns:w16sdtdh="http://schemas.microsoft.com/office/word/2020/wordml/sdtdatahash" xmlns:w16se="http://schemas.microsoft.com/office/word/2015/wordml/symex" mc:Ignorable="w14 w15 w16se w16cid w16 w16cex w16sdtdh">
+<w:styles xmlns:w="http://schemas.openxmlformats.org/wordprocessingml/2006/main" xmlns:w14="http://schemas.microsoft.com/office/word/2010/wordml" xmlns:mc="http://schemas.openxmlformats.org/markup-compatibility/2006" mc:Ignorable="w14">
   <w:docDefaults>
     <w:rPrDefault>
       <w:rPr>
-        <w:rFonts w:asciiTheme="minorHAnsi" w:eastAsiaTheme="minorHAnsi" w:hAnsiTheme="minorHAnsi" w:cstheme="minorBidi"/>
+        <w:rFonts w:ascii="Calibri" w:hAnsi="Calibri" w:eastAsia="Calibri" w:cs="" w:asciiTheme="minorHAnsi" w:cstheme="minorBidi" w:eastAsiaTheme="minorHAnsi" w:hAnsiTheme="minorHAnsi"/>
         <w:sz w:val="22"/>
         <w:szCs w:val="22"/>
         <w:lang w:val="ru-RU" w:eastAsia="en-US" w:bidi="ar-SA"/>
@@ -321,21 +586,21 @@
     </w:rPrDefault>
     <w:pPrDefault>
       <w:pPr>
-        <w:spacing w:after="160" w:line="259" w:lineRule="auto"/>
+        <w:suppressAutoHyphens w:val="true"/>
       </w:pPr>
     </w:pPrDefault>
   </w:docDefaults>
   <w:latentStyles w:defLockedState="0" w:defUIPriority="99" w:defSemiHidden="0" w:defUnhideWhenUsed="0" w:defQFormat="0" w:count="376">
     <w:lsdException w:name="Normal" w:uiPriority="0" w:qFormat="1"/>
     <w:lsdException w:name="heading 1" w:uiPriority="9" w:qFormat="1"/>
-    <w:lsdException w:name="heading 2" w:semiHidden="1" w:uiPriority="9" w:unhideWhenUsed="1" w:qFormat="1"/>
-    <w:lsdException w:name="heading 3" w:semiHidden="1" w:uiPriority="9" w:unhideWhenUsed="1" w:qFormat="1"/>
-    <w:lsdException w:name="heading 4" w:semiHidden="1" w:uiPriority="9" w:unhideWhenUsed="1" w:qFormat="1"/>
-    <w:lsdException w:name="heading 5" w:semiHidden="1" w:uiPriority="9" w:unhideWhenUsed="1" w:qFormat="1"/>
-    <w:lsdException w:name="heading 6" w:semiHidden="1" w:uiPriority="9" w:unhideWhenUsed="1" w:qFormat="1"/>
-    <w:lsdException w:name="heading 7" w:semiHidden="1" w:uiPriority="9" w:unhideWhenUsed="1" w:qFormat="1"/>
-    <w:lsdException w:name="heading 8" w:semiHidden="1" w:uiPriority="9" w:unhideWhenUsed="1" w:qFormat="1"/>
-    <w:lsdException w:name="heading 9" w:semiHidden="1" w:uiPriority="9" w:unhideWhenUsed="1" w:qFormat="1"/>
+    <w:lsdException w:name="heading 2" w:uiPriority="9" w:semiHidden="1" w:unhideWhenUsed="1" w:qFormat="1"/>
+    <w:lsdException w:name="heading 3" w:uiPriority="9" w:semiHidden="1" w:unhideWhenUsed="1" w:qFormat="1"/>
+    <w:lsdException w:name="heading 4" w:uiPriority="9" w:semiHidden="1" w:unhideWhenUsed="1" w:qFormat="1"/>
+    <w:lsdException w:name="heading 5" w:uiPriority="9" w:semiHidden="1" w:unhideWhenUsed="1" w:qFormat="1"/>
+    <w:lsdException w:name="heading 6" w:uiPriority="9" w:semiHidden="1" w:unhideWhenUsed="1" w:qFormat="1"/>
+    <w:lsdException w:name="heading 7" w:uiPriority="9" w:semiHidden="1" w:unhideWhenUsed="1" w:qFormat="1"/>
+    <w:lsdException w:name="heading 8" w:uiPriority="9" w:semiHidden="1" w:unhideWhenUsed="1" w:qFormat="1"/>
+    <w:lsdException w:name="heading 9" w:uiPriority="9" w:semiHidden="1" w:unhideWhenUsed="1" w:qFormat="1"/>
     <w:lsdException w:name="index 1" w:semiHidden="1" w:unhideWhenUsed="1"/>
     <w:lsdException w:name="index 2" w:semiHidden="1" w:unhideWhenUsed="1"/>
     <w:lsdException w:name="index 3" w:semiHidden="1" w:unhideWhenUsed="1"/>
@@ -345,22 +610,22 @@
     <w:lsdException w:name="index 7" w:semiHidden="1" w:unhideWhenUsed="1"/>
     <w:lsdException w:name="index 8" w:semiHidden="1" w:unhideWhenUsed="1"/>
     <w:lsdException w:name="index 9" w:semiHidden="1" w:unhideWhenUsed="1"/>
-    <w:lsdException w:name="toc 1" w:semiHidden="1" w:uiPriority="39" w:unhideWhenUsed="1"/>
-    <w:lsdException w:name="toc 2" w:semiHidden="1" w:uiPriority="39" w:unhideWhenUsed="1"/>
-    <w:lsdException w:name="toc 3" w:semiHidden="1" w:uiPriority="39" w:unhideWhenUsed="1"/>
-    <w:lsdException w:name="toc 4" w:semiHidden="1" w:uiPriority="39" w:unhideWhenUsed="1"/>
-    <w:lsdException w:name="toc 5" w:semiHidden="1" w:uiPriority="39" w:unhideWhenUsed="1"/>
-    <w:lsdException w:name="toc 6" w:semiHidden="1" w:uiPriority="39" w:unhideWhenUsed="1"/>
-    <w:lsdException w:name="toc 7" w:semiHidden="1" w:uiPriority="39" w:unhideWhenUsed="1"/>
-    <w:lsdException w:name="toc 8" w:semiHidden="1" w:uiPriority="39" w:unhideWhenUsed="1"/>
-    <w:lsdException w:name="toc 9" w:semiHidden="1" w:uiPriority="39" w:unhideWhenUsed="1"/>
+    <w:lsdException w:name="toc 1" w:uiPriority="39" w:semiHidden="1" w:unhideWhenUsed="1"/>
+    <w:lsdException w:name="toc 2" w:uiPriority="39" w:semiHidden="1" w:unhideWhenUsed="1"/>
+    <w:lsdException w:name="toc 3" w:uiPriority="39" w:semiHidden="1" w:unhideWhenUsed="1"/>
+    <w:lsdException w:name="toc 4" w:uiPriority="39" w:semiHidden="1" w:unhideWhenUsed="1"/>
+    <w:lsdException w:name="toc 5" w:uiPriority="39" w:semiHidden="1" w:unhideWhenUsed="1"/>
+    <w:lsdException w:name="toc 6" w:uiPriority="39" w:semiHidden="1" w:unhideWhenUsed="1"/>
+    <w:lsdException w:name="toc 7" w:uiPriority="39" w:semiHidden="1" w:unhideWhenUsed="1"/>
+    <w:lsdException w:name="toc 8" w:uiPriority="39" w:semiHidden="1" w:unhideWhenUsed="1"/>
+    <w:lsdException w:name="toc 9" w:uiPriority="39" w:semiHidden="1" w:unhideWhenUsed="1"/>
     <w:lsdException w:name="Normal Indent" w:semiHidden="1" w:unhideWhenUsed="1"/>
     <w:lsdException w:name="footnote text" w:semiHidden="1" w:unhideWhenUsed="1"/>
     <w:lsdException w:name="annotation text" w:semiHidden="1" w:unhideWhenUsed="1"/>
     <w:lsdException w:name="header" w:semiHidden="1" w:unhideWhenUsed="1"/>
     <w:lsdException w:name="footer" w:semiHidden="1" w:unhideWhenUsed="1"/>
     <w:lsdException w:name="index heading" w:semiHidden="1" w:unhideWhenUsed="1"/>
-    <w:lsdException w:name="caption" w:semiHidden="1" w:uiPriority="35" w:unhideWhenUsed="1" w:qFormat="1"/>
+    <w:lsdException w:name="caption" w:uiPriority="35" w:semiHidden="1" w:unhideWhenUsed="1" w:qFormat="1"/>
     <w:lsdException w:name="table of figures" w:semiHidden="1" w:unhideWhenUsed="1"/>
     <w:lsdException w:name="envelope address" w:semiHidden="1" w:unhideWhenUsed="1"/>
     <w:lsdException w:name="envelope return" w:semiHidden="1" w:unhideWhenUsed="1"/>
@@ -391,7 +656,7 @@
     <w:lsdException w:name="Title" w:uiPriority="10" w:qFormat="1"/>
     <w:lsdException w:name="Closing" w:semiHidden="1" w:unhideWhenUsed="1"/>
     <w:lsdException w:name="Signature" w:semiHidden="1" w:unhideWhenUsed="1"/>
-    <w:lsdException w:name="Default Paragraph Font" w:semiHidden="1" w:uiPriority="1" w:unhideWhenUsed="1"/>
+    <w:lsdException w:name="Default Paragraph Font" w:uiPriority="1" w:semiHidden="1" w:unhideWhenUsed="1"/>
     <w:lsdException w:name="Body Text" w:semiHidden="1" w:unhideWhenUsed="1"/>
     <w:lsdException w:name="Body Text Indent" w:semiHidden="1" w:unhideWhenUsed="1"/>
     <w:lsdException w:name="List Continue" w:semiHidden="1" w:unhideWhenUsed="1"/>
@@ -591,8 +856,8 @@
     <w:lsdException w:name="Subtle Reference" w:uiPriority="31" w:qFormat="1"/>
     <w:lsdException w:name="Intense Reference" w:uiPriority="32" w:qFormat="1"/>
     <w:lsdException w:name="Book Title" w:uiPriority="33" w:qFormat="1"/>
-    <w:lsdException w:name="Bibliography" w:semiHidden="1" w:uiPriority="37" w:unhideWhenUsed="1"/>
-    <w:lsdException w:name="TOC Heading" w:semiHidden="1" w:uiPriority="39" w:unhideWhenUsed="1" w:qFormat="1"/>
+    <w:lsdException w:name="Bibliography" w:uiPriority="37" w:semiHidden="1" w:unhideWhenUsed="1"/>
+    <w:lsdException w:name="TOC Heading" w:uiPriority="39" w:semiHidden="1" w:unhideWhenUsed="1" w:qFormat="1"/>
     <w:lsdException w:name="Plain Table 1" w:uiPriority="41"/>
     <w:lsdException w:name="Plain Table 2" w:uiPriority="42"/>
     <w:lsdException w:name="Plain Table 3" w:uiPriority="43"/>
@@ -703,15 +968,233 @@
     <w:lsdException w:name="Unresolved Mention" w:semiHidden="1" w:unhideWhenUsed="1"/>
     <w:lsdException w:name="Smart Link" w:semiHidden="1" w:unhideWhenUsed="1"/>
   </w:latentStyles>
-  <w:style w:type="paragraph" w:default="1" w:styleId="a">
+  <w:style w:type="paragraph" w:styleId="Normal" w:default="1">
     <w:name w:val="Normal"/>
     <w:qFormat/>
-  </w:style>
-  <w:style w:type="character" w:default="1" w:styleId="a0">
+    <w:pPr>
+      <w:widowControl/>
+      <w:bidi w:val="0"/>
+      <w:spacing w:lineRule="auto" w:line="259" w:before="0" w:after="160"/>
+      <w:jc w:val="left"/>
+    </w:pPr>
+    <w:rPr>
+      <w:rFonts w:ascii="Calibri" w:hAnsi="Calibri" w:eastAsia="Calibri" w:cs="" w:asciiTheme="minorHAnsi" w:cstheme="minorBidi" w:eastAsiaTheme="minorHAnsi" w:hAnsiTheme="minorHAnsi"/>
+      <w:color w:val="auto"/>
+      <w:kern w:val="0"/>
+      <w:sz w:val="22"/>
+      <w:szCs w:val="22"/>
+      <w:lang w:val="ru-RU" w:eastAsia="en-US" w:bidi="ar-SA"/>
+    </w:rPr>
+  </w:style>
+  <w:style w:type="character" w:styleId="DefaultParagraphFont" w:default="1">
     <w:name w:val="Default Paragraph Font"/>
     <w:uiPriority w:val="1"/>
     <w:semiHidden/>
     <w:unhideWhenUsed/>
+    <w:qFormat/>
+    <w:rPr/>
+  </w:style>
+  <w:style w:type="character" w:styleId="Style14" w:customStyle="1">
+    <w:name w:val="Заголовок Знак"/>
+    <w:basedOn w:val="DefaultParagraphFont"/>
+    <w:link w:val="Title"/>
+    <w:uiPriority w:val="10"/>
+    <w:qFormat/>
+    <w:rsid w:val="006e3d37"/>
+    <w:rPr>
+      <w:rFonts w:ascii="Calibri Light" w:hAnsi="Calibri Light" w:eastAsia="" w:cs="" w:asciiTheme="majorHAnsi" w:cstheme="majorBidi" w:eastAsiaTheme="majorEastAsia" w:hAnsiTheme="majorHAnsi"/>
+      <w:spacing w:val="-10"/>
+      <w:kern w:val="2"/>
+      <w:sz w:val="56"/>
+      <w:szCs w:val="56"/>
+    </w:rPr>
+  </w:style>
+  <w:style w:type="character" w:styleId="Style15" w:customStyle="1">
+    <w:name w:val="Подзаголовок Знак"/>
+    <w:basedOn w:val="DefaultParagraphFont"/>
+    <w:link w:val="Subtitle"/>
+    <w:uiPriority w:val="11"/>
+    <w:qFormat/>
+    <w:rsid w:val="006e3d37"/>
+    <w:rPr>
+      <w:rFonts w:eastAsia="" w:eastAsiaTheme="minorEastAsia"/>
+      <w:color w:val="5A5A5A" w:themeColor="text1" w:themeTint="a5"/>
+      <w:spacing w:val="15"/>
+    </w:rPr>
+  </w:style>
+  <w:style w:type="character" w:styleId="Annotationreference">
+    <w:name w:val="annotation reference"/>
+    <w:basedOn w:val="DefaultParagraphFont"/>
+    <w:uiPriority w:val="99"/>
+    <w:semiHidden/>
+    <w:unhideWhenUsed/>
+    <w:qFormat/>
+    <w:rsid w:val="00416ca6"/>
+    <w:rPr>
+      <w:sz w:val="16"/>
+      <w:szCs w:val="16"/>
+    </w:rPr>
+  </w:style>
+  <w:style w:type="character" w:styleId="Style16" w:customStyle="1">
+    <w:name w:val="Текст примечания Знак"/>
+    <w:basedOn w:val="DefaultParagraphFont"/>
+    <w:link w:val="Annotationtext"/>
+    <w:uiPriority w:val="99"/>
+    <w:semiHidden/>
+    <w:qFormat/>
+    <w:rsid w:val="00416ca6"/>
+    <w:rPr>
+      <w:sz w:val="20"/>
+      <w:szCs w:val="20"/>
+    </w:rPr>
+  </w:style>
+  <w:style w:type="character" w:styleId="Style17" w:customStyle="1">
+    <w:name w:val="Тема примечания Знак"/>
+    <w:basedOn w:val="Style16"/>
+    <w:link w:val="Annotationsubject"/>
+    <w:uiPriority w:val="99"/>
+    <w:semiHidden/>
+    <w:qFormat/>
+    <w:rsid w:val="00416ca6"/>
+    <w:rPr>
+      <w:b/>
+      <w:bCs/>
+      <w:sz w:val="20"/>
+      <w:szCs w:val="20"/>
+    </w:rPr>
+  </w:style>
+  <w:style w:type="paragraph" w:styleId="Heading">
+    <w:name w:val="Heading"/>
+    <w:basedOn w:val="Normal"/>
+    <w:next w:val="TextBody"/>
+    <w:qFormat/>
+    <w:pPr>
+      <w:keepNext w:val="true"/>
+      <w:spacing w:before="240" w:after="120"/>
+    </w:pPr>
+    <w:rPr>
+      <w:rFonts w:ascii="Liberation Sans" w:hAnsi="Liberation Sans" w:eastAsia="Source Han Sans CN" w:cs="Droid Sans Devanagari"/>
+      <w:sz w:val="28"/>
+      <w:szCs w:val="28"/>
+    </w:rPr>
+  </w:style>
+  <w:style w:type="paragraph" w:styleId="TextBody">
+    <w:name w:val="Body Text"/>
+    <w:basedOn w:val="Normal"/>
+    <w:pPr>
+      <w:spacing w:lineRule="auto" w:line="276" w:before="0" w:after="140"/>
+    </w:pPr>
+    <w:rPr/>
+  </w:style>
+  <w:style w:type="paragraph" w:styleId="List">
+    <w:name w:val="List"/>
+    <w:basedOn w:val="TextBody"/>
+    <w:pPr/>
+    <w:rPr>
+      <w:rFonts w:cs="Droid Sans Devanagari"/>
+    </w:rPr>
+  </w:style>
+  <w:style w:type="paragraph" w:styleId="Caption">
+    <w:name w:val="Caption"/>
+    <w:basedOn w:val="Normal"/>
+    <w:qFormat/>
+    <w:pPr>
+      <w:suppressLineNumbers/>
+      <w:spacing w:before="120" w:after="120"/>
+    </w:pPr>
+    <w:rPr>
+      <w:rFonts w:cs="Droid Sans Devanagari"/>
+      <w:i/>
+      <w:iCs/>
+      <w:sz w:val="24"/>
+      <w:szCs w:val="24"/>
+    </w:rPr>
+  </w:style>
+  <w:style w:type="paragraph" w:styleId="Index">
+    <w:name w:val="Index"/>
+    <w:basedOn w:val="Normal"/>
+    <w:qFormat/>
+    <w:pPr>
+      <w:suppressLineNumbers/>
+    </w:pPr>
+    <w:rPr>
+      <w:rFonts w:cs="Droid Sans Devanagari"/>
+    </w:rPr>
+  </w:style>
+  <w:style w:type="paragraph" w:styleId="Title">
+    <w:name w:val="Title"/>
+    <w:basedOn w:val="Normal"/>
+    <w:next w:val="Normal"/>
+    <w:link w:val="Style14"/>
+    <w:uiPriority w:val="10"/>
+    <w:qFormat/>
+    <w:rsid w:val="006e3d37"/>
+    <w:pPr>
+      <w:spacing w:lineRule="auto" w:line="240" w:before="0" w:after="0"/>
+      <w:contextualSpacing/>
+    </w:pPr>
+    <w:rPr>
+      <w:rFonts w:ascii="Calibri Light" w:hAnsi="Calibri Light" w:eastAsia="" w:cs="" w:asciiTheme="majorHAnsi" w:cstheme="majorBidi" w:eastAsiaTheme="majorEastAsia" w:hAnsiTheme="majorHAnsi"/>
+      <w:spacing w:val="-10"/>
+      <w:kern w:val="2"/>
+      <w:sz w:val="56"/>
+      <w:szCs w:val="56"/>
+    </w:rPr>
+  </w:style>
+  <w:style w:type="paragraph" w:styleId="Subtitle">
+    <w:name w:val="Subtitle"/>
+    <w:basedOn w:val="Normal"/>
+    <w:next w:val="Normal"/>
+    <w:link w:val="Style15"/>
+    <w:uiPriority w:val="11"/>
+    <w:qFormat/>
+    <w:rsid w:val="006e3d37"/>
+    <w:pPr/>
+    <w:rPr>
+      <w:rFonts w:eastAsia="" w:eastAsiaTheme="minorEastAsia"/>
+      <w:color w:val="5A5A5A" w:themeColor="text1" w:themeTint="a5"/>
+      <w:spacing w:val="15"/>
+    </w:rPr>
+  </w:style>
+  <w:style w:type="paragraph" w:styleId="Annotationtext">
+    <w:name w:val="annotation text"/>
+    <w:basedOn w:val="Normal"/>
+    <w:link w:val="Style16"/>
+    <w:uiPriority w:val="99"/>
+    <w:semiHidden/>
+    <w:unhideWhenUsed/>
+    <w:qFormat/>
+    <w:rsid w:val="00416ca6"/>
+    <w:pPr>
+      <w:spacing w:lineRule="auto" w:line="240"/>
+    </w:pPr>
+    <w:rPr>
+      <w:sz w:val="20"/>
+      <w:szCs w:val="20"/>
+    </w:rPr>
+  </w:style>
+  <w:style w:type="paragraph" w:styleId="Annotationsubject">
+    <w:name w:val="annotation subject"/>
+    <w:basedOn w:val="Annotationtext"/>
+    <w:next w:val="Annotationtext"/>
+    <w:link w:val="Style17"/>
+    <w:uiPriority w:val="99"/>
+    <w:semiHidden/>
+    <w:unhideWhenUsed/>
+    <w:qFormat/>
+    <w:rsid w:val="00416ca6"/>
+    <w:pPr/>
+    <w:rPr>
+      <w:b/>
+      <w:bCs/>
+    </w:rPr>
+  </w:style>
+  <w:style w:type="numbering" w:styleId="NoList" w:default="1">
+    <w:name w:val="No List"/>
+    <w:uiPriority w:val="99"/>
+    <w:semiHidden/>
+    <w:unhideWhenUsed/>
+    <w:qFormat/>
   </w:style>
   <w:style w:type="table" w:default="1" w:styleId="a1">
     <w:name w:val="Normal Table"/>
@@ -719,7 +1202,6 @@
     <w:semiHidden/>
     <w:unhideWhenUsed/>
     <w:tblPr>
-      <w:tblInd w:w="0" w:type="dxa"/>
       <w:tblCellMar>
         <w:top w:w="0" w:type="dxa"/>
         <w:left w:w="108" w:type="dxa"/>
@@ -727,145 +1209,6 @@
         <w:right w:w="108" w:type="dxa"/>
       </w:tblCellMar>
     </w:tblPr>
-  </w:style>
-  <w:style w:type="numbering" w:default="1" w:styleId="a2">
-    <w:name w:val="No List"/>
-    <w:uiPriority w:val="99"/>
-    <w:semiHidden/>
-    <w:unhideWhenUsed/>
-  </w:style>
-  <w:style w:type="paragraph" w:styleId="a3">
-    <w:name w:val="Title"/>
-    <w:basedOn w:val="a"/>
-    <w:next w:val="a"/>
-    <w:link w:val="a4"/>
-    <w:uiPriority w:val="10"/>
-    <w:qFormat/>
-    <w:rsid w:val="006E3D37"/>
-    <w:pPr>
-      <w:spacing w:after="0" w:line="240" w:lineRule="auto"/>
-      <w:contextualSpacing/>
-    </w:pPr>
-    <w:rPr>
-      <w:rFonts w:asciiTheme="majorHAnsi" w:eastAsiaTheme="majorEastAsia" w:hAnsiTheme="majorHAnsi" w:cstheme="majorBidi"/>
-      <w:spacing w:val="-10"/>
-      <w:kern w:val="28"/>
-      <w:sz w:val="56"/>
-      <w:szCs w:val="56"/>
-    </w:rPr>
-  </w:style>
-  <w:style w:type="character" w:customStyle="1" w:styleId="a4">
-    <w:name w:val="Заголовок Знак"/>
-    <w:basedOn w:val="a0"/>
-    <w:link w:val="a3"/>
-    <w:uiPriority w:val="10"/>
-    <w:rsid w:val="006E3D37"/>
-    <w:rPr>
-      <w:rFonts w:asciiTheme="majorHAnsi" w:eastAsiaTheme="majorEastAsia" w:hAnsiTheme="majorHAnsi" w:cstheme="majorBidi"/>
-      <w:spacing w:val="-10"/>
-      <w:kern w:val="28"/>
-      <w:sz w:val="56"/>
-      <w:szCs w:val="56"/>
-    </w:rPr>
-  </w:style>
-  <w:style w:type="paragraph" w:styleId="a5">
-    <w:name w:val="Subtitle"/>
-    <w:basedOn w:val="a"/>
-    <w:next w:val="a"/>
-    <w:link w:val="a6"/>
-    <w:uiPriority w:val="11"/>
-    <w:qFormat/>
-    <w:rsid w:val="006E3D37"/>
-    <w:pPr>
-      <w:numPr>
-        <w:ilvl w:val="1"/>
-      </w:numPr>
-    </w:pPr>
-    <w:rPr>
-      <w:rFonts w:eastAsiaTheme="minorEastAsia"/>
-      <w:color w:val="5A5A5A" w:themeColor="text1" w:themeTint="A5"/>
-      <w:spacing w:val="15"/>
-    </w:rPr>
-  </w:style>
-  <w:style w:type="character" w:customStyle="1" w:styleId="a6">
-    <w:name w:val="Подзаголовок Знак"/>
-    <w:basedOn w:val="a0"/>
-    <w:link w:val="a5"/>
-    <w:uiPriority w:val="11"/>
-    <w:rsid w:val="006E3D37"/>
-    <w:rPr>
-      <w:rFonts w:eastAsiaTheme="minorEastAsia"/>
-      <w:color w:val="5A5A5A" w:themeColor="text1" w:themeTint="A5"/>
-      <w:spacing w:val="15"/>
-    </w:rPr>
-  </w:style>
-  <w:style w:type="character" w:styleId="a7">
-    <w:name w:val="annotation reference"/>
-    <w:basedOn w:val="a0"/>
-    <w:uiPriority w:val="99"/>
-    <w:semiHidden/>
-    <w:unhideWhenUsed/>
-    <w:rsid w:val="00416CA6"/>
-    <w:rPr>
-      <w:sz w:val="16"/>
-      <w:szCs w:val="16"/>
-    </w:rPr>
-  </w:style>
-  <w:style w:type="paragraph" w:styleId="a8">
-    <w:name w:val="annotation text"/>
-    <w:basedOn w:val="a"/>
-    <w:link w:val="a9"/>
-    <w:uiPriority w:val="99"/>
-    <w:semiHidden/>
-    <w:unhideWhenUsed/>
-    <w:rsid w:val="00416CA6"/>
-    <w:pPr>
-      <w:spacing w:line="240" w:lineRule="auto"/>
-    </w:pPr>
-    <w:rPr>
-      <w:sz w:val="20"/>
-      <w:szCs w:val="20"/>
-    </w:rPr>
-  </w:style>
-  <w:style w:type="character" w:customStyle="1" w:styleId="a9">
-    <w:name w:val="Текст примечания Знак"/>
-    <w:basedOn w:val="a0"/>
-    <w:link w:val="a8"/>
-    <w:uiPriority w:val="99"/>
-    <w:semiHidden/>
-    <w:rsid w:val="00416CA6"/>
-    <w:rPr>
-      <w:sz w:val="20"/>
-      <w:szCs w:val="20"/>
-    </w:rPr>
-  </w:style>
-  <w:style w:type="paragraph" w:styleId="aa">
-    <w:name w:val="annotation subject"/>
-    <w:basedOn w:val="a8"/>
-    <w:next w:val="a8"/>
-    <w:link w:val="ab"/>
-    <w:uiPriority w:val="99"/>
-    <w:semiHidden/>
-    <w:unhideWhenUsed/>
-    <w:rsid w:val="00416CA6"/>
-    <w:rPr>
-      <w:b/>
-      <w:bCs/>
-    </w:rPr>
-  </w:style>
-  <w:style w:type="character" w:customStyle="1" w:styleId="ab">
-    <w:name w:val="Тема примечания Знак"/>
-    <w:basedOn w:val="a9"/>
-    <w:link w:val="aa"/>
-    <w:uiPriority w:val="99"/>
-    <w:semiHidden/>
-    <w:rsid w:val="00416CA6"/>
-    <w:rPr>
-      <w:b/>
-      <w:bCs/>
-      <w:sz w:val="20"/>
-      <w:szCs w:val="20"/>
-    </w:rPr>
   </w:style>
 </w:styles>
 </file>

</xml_diff>